<commit_message>
revision4: letter - slight neutral notes where the answer was already in the submitted version (C2/C4/C5)
Co-Authored-By: Claude Opus 4.8 <noreply@anthropic.com>
</commit_message>
<xml_diff>
--- a/review_round_2/letter_round2.docx
+++ b/review_round_2/letter_round2.docx
@@ -271,7 +271,7 @@
         <w:t xml:space="preserve"> </w:t>
       </w:r>
       <w:r>
-        <w:t xml:space="preserve">over comparable standardized surprises. The dataset-dependence is expected and already reported: the whole-plant</w:t>
+        <w:t xml:space="preserve">over comparable standardized surprises. The dataset-dependence is expected and was already reported in the submitted version, in Appendix A (the figures the reviewer cites are from that appendix): the whole-plant</w:t>
       </w:r>
       <w:r>
         <w:t xml:space="preserve"> </w:t>
@@ -461,7 +461,13 @@
         <w:t xml:space="preserve"> </w:t>
       </w:r>
       <w:r>
-        <w:t xml:space="preserve">superiority claim. The single significant headline is HAI (+0.088, 95 percent CI [0.042, 0.157]); the</w:t>
+        <w:t xml:space="preserve">superiority claim; the submitted version already reports it this way, and we have now made the subset's limited</w:t>
+      </w:r>
+      <w:r>
+        <w:t xml:space="preserve"> </w:t>
+      </w:r>
+      <w:r>
+        <w:t xml:space="preserve">power explicit. The single significant headline is HAI (+0.088, 95 percent CI [0.042, 0.157]); the</w:t>
       </w:r>
       <w:r>
         <w:t xml:space="preserve"> </w:t>
@@ -545,7 +551,7 @@
         <w:t xml:space="preserve"> </w:t>
       </w:r>
       <w:r>
-        <w:t xml:space="preserve">recently introduced and both reconstruction-based, which the §8 mechanism analysis predicts inherit the same</w:t>
+        <w:t xml:space="preserve">recently introduced and both reconstruction-based; both were already discussed in the submitted version, and the §8 mechanism analysis predicts they inherit the same</w:t>
       </w:r>
       <w:r>
         <w:t xml:space="preserve"> </w:t>

</xml_diff>